<commit_message>
Report: table of contents (Word TOC field, pre-filled page numbers) and page-number footer
Co-Authored-By: Claude Opus 5.5 <noreply@anthropic.com>
</commit_message>
<xml_diff>
--- a/Report/Communication_Drone_Final_Report.docx
+++ b/Report/Communication_Drone_Final_Report.docx
@@ -103,6 +103,559 @@
           <w:sz w:val="18"/>
         </w:rPr>
         <w:t>Code, trained models and results: github.com/cosmosapien200/communication-drone-relay-sim</w:t>
+      </w:r>
+    </w:p>
+    <w:p>
+      <w:r>
+        <w:br w:type="page"/>
+      </w:r>
+    </w:p>
+    <w:p>
+      <w:pPr>
+        <w:pStyle w:val="TOCHeading"/>
+      </w:pPr>
+      <w:r>
+        <w:t>Table of Contents</w:t>
+      </w:r>
+    </w:p>
+    <w:p>
+      <w:pPr>
+        <w:pStyle w:val="toc1"/>
+      </w:pPr>
+      <w:r>
+        <w:fldChar w:fldCharType="begin"/>
+      </w:r>
+      <w:r>
+        <w:instrText xml:space="preserve"> TOC \o "1-2" \u </w:instrText>
+      </w:r>
+      <w:r>
+        <w:fldChar w:fldCharType="separate"/>
+      </w:r>
+      <w:r>
+        <w:t>1. Abstract</w:t>
+      </w:r>
+      <w:r>
+        <w:tab/>
+        <w:t>3</w:t>
+      </w:r>
+    </w:p>
+    <w:p>
+      <w:pPr>
+        <w:pStyle w:val="toc1"/>
+      </w:pPr>
+      <w:r>
+        <w:t>2. Introduction</w:t>
+      </w:r>
+      <w:r>
+        <w:tab/>
+        <w:t>3</w:t>
+      </w:r>
+    </w:p>
+    <w:p>
+      <w:pPr>
+        <w:pStyle w:val="toc1"/>
+      </w:pPr>
+      <w:r>
+        <w:t>3. Problem Statement</w:t>
+      </w:r>
+      <w:r>
+        <w:tab/>
+        <w:t>4</w:t>
+      </w:r>
+    </w:p>
+    <w:p>
+      <w:pPr>
+        <w:pStyle w:val="toc1"/>
+      </w:pPr>
+      <w:r>
+        <w:t>4. Literature Review</w:t>
+      </w:r>
+      <w:r>
+        <w:tab/>
+        <w:t>5</w:t>
+      </w:r>
+    </w:p>
+    <w:p>
+      <w:pPr>
+        <w:pStyle w:val="toc2"/>
+      </w:pPr>
+      <w:r>
+        <w:t>4.1 Drone-based emergency communication (from Review 1)</w:t>
+      </w:r>
+      <w:r>
+        <w:tab/>
+        <w:t>5</w:t>
+      </w:r>
+    </w:p>
+    <w:p>
+      <w:pPr>
+        <w:pStyle w:val="toc2"/>
+      </w:pPr>
+      <w:r>
+        <w:t>4.2 Semantic segmentation</w:t>
+      </w:r>
+      <w:r>
+        <w:tab/>
+        <w:t>6</w:t>
+      </w:r>
+    </w:p>
+    <w:p>
+      <w:pPr>
+        <w:pStyle w:val="toc2"/>
+      </w:pPr>
+      <w:r>
+        <w:t>4.3 Synthetic data and domain randomisation</w:t>
+      </w:r>
+      <w:r>
+        <w:tab/>
+        <w:t>6</w:t>
+      </w:r>
+    </w:p>
+    <w:p>
+      <w:pPr>
+        <w:pStyle w:val="toc2"/>
+      </w:pPr>
+      <w:r>
+        <w:t>4.4 Vision-based safe landing for UAVs</w:t>
+      </w:r>
+      <w:r>
+        <w:tab/>
+        <w:t>6</w:t>
+      </w:r>
+    </w:p>
+    <w:p>
+      <w:pPr>
+        <w:pStyle w:val="toc2"/>
+      </w:pPr>
+      <w:r>
+        <w:t>4.5 Mapping, exploration and learning-based control</w:t>
+      </w:r>
+      <w:r>
+        <w:tab/>
+        <w:t>6</w:t>
+      </w:r>
+    </w:p>
+    <w:p>
+      <w:pPr>
+        <w:pStyle w:val="toc2"/>
+      </w:pPr>
+      <w:r>
+        <w:t>4.6 Research gap</w:t>
+      </w:r>
+      <w:r>
+        <w:tab/>
+        <w:t>7</w:t>
+      </w:r>
+    </w:p>
+    <w:p>
+      <w:pPr>
+        <w:pStyle w:val="toc1"/>
+      </w:pPr>
+      <w:r>
+        <w:t>5. Dataset Description</w:t>
+      </w:r>
+      <w:r>
+        <w:tab/>
+        <w:t>7</w:t>
+      </w:r>
+    </w:p>
+    <w:p>
+      <w:pPr>
+        <w:pStyle w:val="toc2"/>
+      </w:pPr>
+      <w:r>
+        <w:t>5.1 Generation pipeline</w:t>
+      </w:r>
+      <w:r>
+        <w:tab/>
+        <w:t>7</w:t>
+      </w:r>
+    </w:p>
+    <w:p>
+      <w:pPr>
+        <w:pStyle w:val="toc2"/>
+      </w:pPr>
+      <w:r>
+        <w:t>5.2 Classes</w:t>
+      </w:r>
+      <w:r>
+        <w:tab/>
+        <w:t>8</w:t>
+      </w:r>
+    </w:p>
+    <w:p>
+      <w:pPr>
+        <w:pStyle w:val="toc2"/>
+      </w:pPr>
+      <w:r>
+        <w:t>5.3 Splits and statistics</w:t>
+      </w:r>
+      <w:r>
+        <w:tab/>
+        <w:t>8</w:t>
+      </w:r>
+    </w:p>
+    <w:p>
+      <w:pPr>
+        <w:pStyle w:val="toc1"/>
+      </w:pPr>
+      <w:r>
+        <w:t>6. Methodology</w:t>
+      </w:r>
+      <w:r>
+        <w:tab/>
+        <w:t>9</w:t>
+      </w:r>
+    </w:p>
+    <w:p>
+      <w:pPr>
+        <w:pStyle w:val="toc2"/>
+      </w:pPr>
+      <w:r>
+        <w:t>6.1 System overview</w:t>
+      </w:r>
+      <w:r>
+        <w:tab/>
+        <w:t>9</w:t>
+      </w:r>
+    </w:p>
+    <w:p>
+      <w:pPr>
+        <w:pStyle w:val="toc2"/>
+      </w:pPr>
+      <w:r>
+        <w:t>6.2 Landable-surface segmentation network</w:t>
+      </w:r>
+      <w:r>
+        <w:tab/>
+        <w:t>9</w:t>
+      </w:r>
+    </w:p>
+    <w:p>
+      <w:pPr>
+        <w:pStyle w:val="toc2"/>
+      </w:pPr>
+      <w:r>
+        <w:t>6.3 Ground projection</w:t>
+      </w:r>
+      <w:r>
+        <w:tab/>
+        <w:t>10</w:t>
+      </w:r>
+    </w:p>
+    <w:p>
+      <w:pPr>
+        <w:pStyle w:val="toc2"/>
+      </w:pPr>
+      <w:r>
+        <w:t>6.4 Evidence fusion into the shared landable map</w:t>
+      </w:r>
+      <w:r>
+        <w:tab/>
+        <w:t>10</w:t>
+      </w:r>
+    </w:p>
+    <w:p>
+      <w:pPr>
+        <w:pStyle w:val="toc2"/>
+      </w:pPr>
+      <w:r>
+        <w:t>6.5 Camera gimbal control</w:t>
+      </w:r>
+      <w:r>
+        <w:tab/>
+        <w:t>11</w:t>
+      </w:r>
+    </w:p>
+    <w:p>
+      <w:pPr>
+        <w:pStyle w:val="toc2"/>
+      </w:pPr>
+      <w:r>
+        <w:t>6.6 Landing-spot locator</w:t>
+      </w:r>
+      <w:r>
+        <w:tab/>
+        <w:t>11</w:t>
+      </w:r>
+    </w:p>
+    <w:p>
+      <w:pPr>
+        <w:pStyle w:val="toc2"/>
+      </w:pPr>
+      <w:r>
+        <w:t>6.7 Vision noise model</w:t>
+      </w:r>
+      <w:r>
+        <w:tab/>
+        <w:t>11</w:t>
+      </w:r>
+    </w:p>
+    <w:p>
+      <w:pPr>
+        <w:pStyle w:val="toc2"/>
+      </w:pPr>
+      <w:r>
+        <w:t>6.8 Reinforcement learning, flight and communication (summary)</w:t>
+      </w:r>
+      <w:r>
+        <w:tab/>
+        <w:t>11</w:t>
+      </w:r>
+    </w:p>
+    <w:p>
+      <w:pPr>
+        <w:pStyle w:val="toc2"/>
+      </w:pPr>
+      <w:r>
+        <w:t>6.9 Overall vision pipeline</w:t>
+      </w:r>
+      <w:r>
+        <w:tab/>
+        <w:t>12</w:t>
+      </w:r>
+    </w:p>
+    <w:p>
+      <w:pPr>
+        <w:pStyle w:val="toc1"/>
+      </w:pPr>
+      <w:r>
+        <w:t>7. Implementation</w:t>
+      </w:r>
+      <w:r>
+        <w:tab/>
+        <w:t>12</w:t>
+      </w:r>
+    </w:p>
+    <w:p>
+      <w:pPr>
+        <w:pStyle w:val="toc2"/>
+      </w:pPr>
+      <w:r>
+        <w:t>7.1 Code organisation</w:t>
+      </w:r>
+      <w:r>
+        <w:tab/>
+        <w:t>13</w:t>
+      </w:r>
+    </w:p>
+    <w:p>
+      <w:pPr>
+        <w:pStyle w:val="toc2"/>
+      </w:pPr>
+      <w:r>
+        <w:t>7.2 Training procedure</w:t>
+      </w:r>
+      <w:r>
+        <w:tab/>
+        <w:t>13</w:t>
+      </w:r>
+    </w:p>
+    <w:p>
+      <w:pPr>
+        <w:pStyle w:val="toc2"/>
+      </w:pPr>
+      <w:r>
+        <w:t>7.3 Deployment inside the simulator and verification</w:t>
+      </w:r>
+      <w:r>
+        <w:tab/>
+        <w:t>13</w:t>
+      </w:r>
+    </w:p>
+    <w:p>
+      <w:pPr>
+        <w:pStyle w:val="toc2"/>
+      </w:pPr>
+      <w:r>
+        <w:t>7.4 Simulation demonstration</w:t>
+      </w:r>
+      <w:r>
+        <w:tab/>
+        <w:t>14</w:t>
+      </w:r>
+    </w:p>
+    <w:p>
+      <w:pPr>
+        <w:pStyle w:val="toc1"/>
+      </w:pPr>
+      <w:r>
+        <w:t>8. Experimental Results</w:t>
+      </w:r>
+      <w:r>
+        <w:tab/>
+        <w:t>14</w:t>
+      </w:r>
+    </w:p>
+    <w:p>
+      <w:pPr>
+        <w:pStyle w:val="toc2"/>
+      </w:pPr>
+      <w:r>
+        <w:t>8.1 Segmentation accuracy</w:t>
+      </w:r>
+      <w:r>
+        <w:tab/>
+        <w:t>15</w:t>
+      </w:r>
+    </w:p>
+    <w:p>
+      <w:pPr>
+        <w:pStyle w:val="toc2"/>
+      </w:pPr>
+      <w:r>
+        <w:t>8.2 Accuracy by viewing condition</w:t>
+      </w:r>
+      <w:r>
+        <w:tab/>
+        <w:t>16</w:t>
+      </w:r>
+    </w:p>
+    <w:p>
+      <w:pPr>
+        <w:pStyle w:val="toc2"/>
+      </w:pPr>
+      <w:r>
+        <w:t>8.3 Qualitative results and failure cases</w:t>
+      </w:r>
+      <w:r>
+        <w:tab/>
+        <w:t>17</w:t>
+      </w:r>
+    </w:p>
+    <w:p>
+      <w:pPr>
+        <w:pStyle w:val="toc2"/>
+      </w:pPr>
+      <w:r>
+        <w:t>8.4 Landing-spot localisation</w:t>
+      </w:r>
+      <w:r>
+        <w:tab/>
+        <w:t>18</w:t>
+      </w:r>
+    </w:p>
+    <w:p>
+      <w:pPr>
+        <w:pStyle w:val="toc2"/>
+      </w:pPr>
+      <w:r>
+        <w:t>8.5 Landing with vision in the loop</w:t>
+      </w:r>
+      <w:r>
+        <w:tab/>
+        <w:t>19</w:t>
+      </w:r>
+    </w:p>
+    <w:p>
+      <w:pPr>
+        <w:pStyle w:val="toc2"/>
+      </w:pPr>
+      <w:r>
+        <w:t>8.6 Mission-level effect of perception</w:t>
+      </w:r>
+      <w:r>
+        <w:tab/>
+        <w:t>19</w:t>
+      </w:r>
+    </w:p>
+    <w:p>
+      <w:pPr>
+        <w:pStyle w:val="toc1"/>
+      </w:pPr>
+      <w:r>
+        <w:t>9. Performance Evaluation</w:t>
+      </w:r>
+      <w:r>
+        <w:tab/>
+        <w:t>20</w:t>
+      </w:r>
+    </w:p>
+    <w:p>
+      <w:pPr>
+        <w:pStyle w:val="toc2"/>
+      </w:pPr>
+      <w:r>
+        <w:t>9.1 Comparison with Review 1 objectives</w:t>
+      </w:r>
+      <w:r>
+        <w:tab/>
+        <w:t>20</w:t>
+      </w:r>
+    </w:p>
+    <w:p>
+      <w:pPr>
+        <w:pStyle w:val="toc2"/>
+      </w:pPr>
+      <w:r>
+        <w:t>9.2 Strengths</w:t>
+      </w:r>
+      <w:r>
+        <w:tab/>
+        <w:t>21</w:t>
+      </w:r>
+    </w:p>
+    <w:p>
+      <w:pPr>
+        <w:pStyle w:val="toc2"/>
+      </w:pPr>
+      <w:r>
+        <w:t>9.3 Limitations</w:t>
+      </w:r>
+      <w:r>
+        <w:tab/>
+        <w:t>21</w:t>
+      </w:r>
+    </w:p>
+    <w:p>
+      <w:pPr>
+        <w:pStyle w:val="toc2"/>
+      </w:pPr>
+      <w:r>
+        <w:t>9.4 Failure analysis of the live demonstration</w:t>
+      </w:r>
+      <w:r>
+        <w:tab/>
+        <w:t>21</w:t>
+      </w:r>
+    </w:p>
+    <w:p>
+      <w:pPr>
+        <w:pStyle w:val="toc1"/>
+      </w:pPr>
+      <w:r>
+        <w:t>10. Conclusion</w:t>
+      </w:r>
+      <w:r>
+        <w:tab/>
+        <w:t>22</w:t>
+      </w:r>
+    </w:p>
+    <w:p>
+      <w:pPr>
+        <w:pStyle w:val="toc1"/>
+      </w:pPr>
+      <w:r>
+        <w:t>11. Future Scope</w:t>
+      </w:r>
+      <w:r>
+        <w:tab/>
+        <w:t>23</w:t>
+      </w:r>
+    </w:p>
+    <w:p>
+      <w:pPr>
+        <w:pStyle w:val="toc1"/>
+      </w:pPr>
+      <w:r>
+        <w:t>12. References</w:t>
+      </w:r>
+      <w:r>
+        <w:tab/>
+        <w:t>23</w:t>
+      </w:r>
+      <w:r>
+        <w:fldChar w:fldCharType="end"/>
       </w:r>
     </w:p>
     <w:p>
@@ -641,7 +1194,7 @@
                     <pic:cNvPicPr/>
                   </pic:nvPicPr>
                   <pic:blipFill>
-                    <a:blip r:embed="rId12"/>
+                    <a:blip r:embed="rId13"/>
                     <a:stretch>
                       <a:fillRect/>
                     </a:stretch>
@@ -1699,7 +2252,7 @@
                     <pic:cNvPicPr/>
                   </pic:nvPicPr>
                   <pic:blipFill>
-                    <a:blip r:embed="rId13"/>
+                    <a:blip r:embed="rId14"/>
                     <a:stretch>
                       <a:fillRect/>
                     </a:stretch>
@@ -1794,7 +2347,7 @@
                     <pic:cNvPicPr/>
                   </pic:nvPicPr>
                   <pic:blipFill>
-                    <a:blip r:embed="rId14"/>
+                    <a:blip r:embed="rId15"/>
                     <a:stretch>
                       <a:fillRect/>
                     </a:stretch>
@@ -2420,7 +2973,7 @@
                     <pic:cNvPicPr/>
                   </pic:nvPicPr>
                   <pic:blipFill>
-                    <a:blip r:embed="rId15"/>
+                    <a:blip r:embed="rId16"/>
                     <a:stretch>
                       <a:fillRect/>
                     </a:stretch>
@@ -2857,7 +3410,7 @@
                     <pic:cNvPicPr/>
                   </pic:nvPicPr>
                   <pic:blipFill>
-                    <a:blip r:embed="rId16"/>
+                    <a:blip r:embed="rId17"/>
                     <a:stretch>
                       <a:fillRect/>
                     </a:stretch>
@@ -2964,7 +3517,7 @@
                     <pic:cNvPicPr/>
                   </pic:nvPicPr>
                   <pic:blipFill>
-                    <a:blip r:embed="rId17"/>
+                    <a:blip r:embed="rId18"/>
                     <a:stretch>
                       <a:fillRect/>
                     </a:stretch>
@@ -3583,7 +4136,7 @@
                     <pic:cNvPicPr/>
                   </pic:nvPicPr>
                   <pic:blipFill>
-                    <a:blip r:embed="rId18"/>
+                    <a:blip r:embed="rId19"/>
                     <a:stretch>
                       <a:fillRect/>
                     </a:stretch>
@@ -4419,7 +4972,7 @@
                     <pic:cNvPicPr/>
                   </pic:nvPicPr>
                   <pic:blipFill>
-                    <a:blip r:embed="rId19"/>
+                    <a:blip r:embed="rId20"/>
                     <a:stretch>
                       <a:fillRect/>
                     </a:stretch>
@@ -5404,7 +5957,7 @@
                     <pic:cNvPicPr/>
                   </pic:nvPicPr>
                   <pic:blipFill>
-                    <a:blip r:embed="rId20"/>
+                    <a:blip r:embed="rId21"/>
                     <a:stretch>
                       <a:fillRect/>
                     </a:stretch>
@@ -5459,7 +6012,7 @@
                     <pic:cNvPicPr/>
                   </pic:nvPicPr>
                   <pic:blipFill>
-                    <a:blip r:embed="rId21"/>
+                    <a:blip r:embed="rId22"/>
                     <a:stretch>
                       <a:fillRect/>
                     </a:stretch>
@@ -7185,7 +7738,7 @@
                     <pic:cNvPicPr/>
                   </pic:nvPicPr>
                   <pic:blipFill>
-                    <a:blip r:embed="rId22"/>
+                    <a:blip r:embed="rId23"/>
                     <a:stretch>
                       <a:fillRect/>
                     </a:stretch>
@@ -9140,16 +9693,113 @@
       </w:r>
     </w:p>
     <w:sectPr>
+      <w:footerReference w:type="default" r:id="rId12"/>
       <w:type w:val="nextPage"/>
       <w:pgSz w:w="12240" w:h="15840"/>
       <w:pgMar w:left="1440" w:right="1440" w:gutter="0" w:header="0" w:top="1296" w:footer="0" w:bottom="1296"/>
       <w:pgNumType w:fmt="decimal"/>
       <w:formProt w:val="false"/>
+      <w:titlePg/>
       <w:textDirection w:val="lrTb"/>
       <w:docGrid w:type="default" w:linePitch="360" w:charSpace="0"/>
     </w:sectPr>
   </w:body>
 </w:document>
+</file>
+
+<file path=word/footer1.xml><?xml version="1.0" encoding="utf-8"?>
+<w:ftr xmlns:m="http://schemas.openxmlformats.org/officeDocument/2006/math" xmlns:mc="http://schemas.openxmlformats.org/markup-compatibility/2006" xmlns:mo="http://schemas.microsoft.com/office/mac/office/2008/main" xmlns:mv="urn:schemas-microsoft-com:mac:vml" xmlns:o="urn:schemas-microsoft-com:office:office" xmlns:r="http://schemas.openxmlformats.org/officeDocument/2006/relationships" xmlns:v="urn:schemas-microsoft-com:vml" xmlns:w10="urn:schemas-microsoft-com:office:word" xmlns:w14="http://schemas.microsoft.com/office/word/2010/wordml" xmlns:w="http://schemas.openxmlformats.org/wordprocessingml/2006/main" xmlns:wne="http://schemas.microsoft.com/office/word/2006/wordml" xmlns:wp14="http://schemas.microsoft.com/office/word/2010/wordprocessingDrawing" xmlns:wp="http://schemas.openxmlformats.org/drawingml/2006/wordprocessingDrawing" xmlns:wpc="http://schemas.microsoft.com/office/word/2010/wordprocessingCanvas" xmlns:wpg="http://schemas.microsoft.com/office/word/2010/wordprocessingGroup" xmlns:wpi="http://schemas.microsoft.com/office/word/2010/wordprocessingInk" xmlns:wps="http://schemas.microsoft.com/office/word/2010/wordprocessingShape" mc:Ignorable="w14 wp14">
+  <w:p>
+    <w:pPr>
+      <w:pStyle w:val="Footer"/>
+      <w:jc w:val="center"/>
+    </w:pPr>
+    <w:r>
+      <w:rPr>
+        <w:color w:val="595959"/>
+        <w:sz w:val="18"/>
+      </w:rPr>
+      <w:t xml:space="preserve">Page </w:t>
+    </w:r>
+    <w:r>
+      <w:rPr>
+        <w:color w:val="595959"/>
+        <w:sz w:val="18"/>
+      </w:rPr>
+      <w:fldChar w:fldCharType="begin"/>
+    </w:r>
+    <w:r>
+      <w:rPr>
+        <w:color w:val="595959"/>
+        <w:sz w:val="18"/>
+      </w:rPr>
+      <w:instrText xml:space="preserve"> PAGE </w:instrText>
+    </w:r>
+    <w:r>
+      <w:rPr>
+        <w:color w:val="595959"/>
+        <w:sz w:val="18"/>
+      </w:rPr>
+      <w:fldChar w:fldCharType="separate"/>
+    </w:r>
+    <w:r>
+      <w:rPr>
+        <w:color w:val="595959"/>
+        <w:sz w:val="18"/>
+      </w:rPr>
+      <w:t>1</w:t>
+    </w:r>
+    <w:r>
+      <w:rPr>
+        <w:color w:val="595959"/>
+        <w:sz w:val="18"/>
+      </w:rPr>
+      <w:fldChar w:fldCharType="end"/>
+    </w:r>
+    <w:r>
+      <w:rPr>
+        <w:color w:val="595959"/>
+        <w:sz w:val="18"/>
+      </w:rPr>
+      <w:t xml:space="preserve"> of </w:t>
+    </w:r>
+    <w:r>
+      <w:rPr>
+        <w:color w:val="595959"/>
+        <w:sz w:val="18"/>
+      </w:rPr>
+      <w:fldChar w:fldCharType="begin"/>
+    </w:r>
+    <w:r>
+      <w:rPr>
+        <w:color w:val="595959"/>
+        <w:sz w:val="18"/>
+      </w:rPr>
+      <w:instrText xml:space="preserve"> NUMPAGES </w:instrText>
+    </w:r>
+    <w:r>
+      <w:rPr>
+        <w:color w:val="595959"/>
+        <w:sz w:val="18"/>
+      </w:rPr>
+      <w:fldChar w:fldCharType="separate"/>
+    </w:r>
+    <w:r>
+      <w:rPr>
+        <w:color w:val="595959"/>
+        <w:sz w:val="18"/>
+      </w:rPr>
+      <w:t>1</w:t>
+    </w:r>
+    <w:r>
+      <w:rPr>
+        <w:color w:val="595959"/>
+        <w:sz w:val="18"/>
+      </w:rPr>
+      <w:fldChar w:fldCharType="end"/>
+    </w:r>
+  </w:p>
+</w:ftr>
 </file>
 
 <file path=word/numbering.xml><?xml version="1.0" encoding="utf-8"?>
@@ -22966,6 +23616,36 @@
       </w:tcPr>
     </w:tblStylePr>
   </w:style>
+  <w:style w:type="paragraph" w:customStyle="1" w:styleId="toc1">
+    <w:name w:val="toc 1"/>
+    <w:basedOn w:val="Normal"/>
+    <w:pPr>
+      <w:tabs>
+        <w:tab w:pos="9360" w:val="right" w:leader="dot"/>
+      </w:tabs>
+      <w:spacing w:before="60" w:after="0" w:line="240" w:lineRule="auto"/>
+      <w:ind w:left="0"/>
+    </w:pPr>
+    <w:rPr>
+      <w:b/>
+      <w:sz w:val="21"/>
+    </w:rPr>
+  </w:style>
+  <w:style w:type="paragraph" w:customStyle="1" w:styleId="toc2">
+    <w:name w:val="toc 2"/>
+    <w:basedOn w:val="Normal"/>
+    <w:pPr>
+      <w:tabs>
+        <w:tab w:pos="9360" w:val="right" w:leader="dot"/>
+      </w:tabs>
+      <w:spacing w:before="0" w:after="0" w:line="240" w:lineRule="auto"/>
+      <w:ind w:left="432"/>
+    </w:pPr>
+    <w:rPr>
+      <w:b w:val="0"/>
+      <w:sz w:val="19"/>
+    </w:rPr>
+  </w:style>
 </w:styles>
 </file>
 

</xml_diff>